<commit_message>
Sync the CV document with the site: fourth preprint, en dashes
Adds the Euler-Arnold entry with its attribution note to the
publications list and switches the four Kolmogorov-Arnold mentions to
en dashes, matching content/cv.md. Re-exported to static/files/cv.pdf;
still two pages, layout unchanged.

Co-Authored-By: Claude Opus 5 <noreply@anthropic.com>
</commit_message>
<xml_diff>
--- a/CV_for_MSc.docx
+++ b/CV_for_MSc.docx
@@ -234,15 +234,7 @@
           <w:bCs/>
           <w:color w:val="1D1C1D"/>
         </w:rPr>
-        <w:t xml:space="preserve">A. Salkimbayev</w:t>
-      </w:r>
-      <w:r>
-        <w:rPr>
-          <w:b/>
-          <w:bCs/>
-          <w:color w:val="1D1C1D"/>
-        </w:rPr>
-        <w:t xml:space="preserve">. </w:t>
+        <w:t xml:space="preserve">A. Salkimbayev. </w:t>
       </w:r>
       <w:r>
         <w:rPr>
@@ -281,22 +273,14 @@
           <w:bCs/>
           <w:color w:val="1D1C1D"/>
         </w:rPr>
-        <w:t xml:space="preserve">A. Salkimbayev, K.S. Haider</w:t>
-      </w:r>
-      <w:r>
-        <w:rPr>
-          <w:b/>
-          <w:bCs/>
-          <w:color w:val="1D1C1D"/>
-        </w:rPr>
-        <w:t xml:space="preserve">. </w:t>
-      </w:r>
-      <w:r>
-        <w:rPr>
-          <w:bCs/>
-          <w:color w:val="1D1C1D"/>
-        </w:rPr>
-        <w:t xml:space="preserve">“Robust Adaptive Kolmogorov-Arnold Neural Control.” </w:t>
+        <w:t xml:space="preserve">A. Salkimbayev, K.S. Haider. </w:t>
+      </w:r>
+      <w:r>
+        <w:rPr>
+          <w:bCs/>
+          <w:color w:val="1D1C1D"/>
+        </w:rPr>
+        <w:t xml:space="preserve">“Robust Adaptive Kolmogorov–Arnold Neural Control.” </w:t>
       </w:r>
       <w:r>
         <w:rPr>
@@ -328,15 +312,7 @@
           <w:bCs/>
           <w:color w:val="1D1C1D"/>
         </w:rPr>
-        <w:t xml:space="preserve">A. Salkimbayev</w:t>
-      </w:r>
-      <w:r>
-        <w:rPr>
-          <w:b/>
-          <w:bCs/>
-          <w:color w:val="1D1C1D"/>
-        </w:rPr>
-        <w:t xml:space="preserve">. </w:t>
+        <w:t xml:space="preserve">A. Salkimbayev. </w:t>
       </w:r>
       <w:r>
         <w:rPr>
@@ -353,6 +329,45 @@
           <w:color w:val="1D1C1D"/>
         </w:rPr>
         <w:t xml:space="preserve">Expository article; preprint, 34 pp.</w:t>
+      </w:r>
+    </w:p>
+    <w:p>
+      <w:pPr>
+        <w:pStyle w:val="ListParagraph"/>
+        <w:numPr>
+          <w:ilvl w:val="0"/>
+          <w:numId w:val="9"/>
+        </w:numPr>
+        <w:spacing w:line="240" w:lineRule="auto"/>
+        <w:ind w:right="180"/>
+        <w:rPr>
+          <w:bCs/>
+          <w:color w:val="1D1C1D"/>
+        </w:rPr>
+      </w:pPr>
+      <w:r>
+        <w:rPr>
+          <w:b/>
+          <w:bCs/>
+          <w:color w:val="1D1C1D"/>
+        </w:rPr>
+        <w:t xml:space="preserve">A. Salkimbayev. </w:t>
+      </w:r>
+      <w:r>
+        <w:rPr>
+          <w:bCs/>
+          <w:color w:val="1D1C1D"/>
+        </w:rPr>
+        <w:t xml:space="preserve">“Rigidity of the Euler–Arnold Form under Energy-Preserving Deformation.” </w:t>
+      </w:r>
+      <w:r>
+        <w:rPr>
+          <w:bCs/>
+          <w:i/>
+          <w:iCs/>
+          <w:color w:val="1D1C1D"/>
+        </w:rPr>
+        <w:t xml:space="preserve">Preprint, September 2026; produced with substantial AI assistance under my direction, not yet independently reviewed.</w:t>
       </w:r>
     </w:p>
     <w:p>
@@ -552,7 +567,7 @@
         <w:rPr>
           <w:color w:val="1D1C1D"/>
         </w:rPr>
-        <w:t>Developed a learning-based adaptive control architecture combining Recursive Least Squares with symbolic Kolmogorov-Arnold Networks (KANs).</w:t>
+        <w:t>Developed a learning-based adaptive control architecture combining Recursive Least Squares with symbolic Kolmogorov–Arnold Networks (KANs).</w:t>
       </w:r>
     </w:p>
     <w:p>
@@ -682,7 +697,7 @@
         <w:rPr>
           <w:color w:val="1D1C1D"/>
         </w:rPr>
-        <w:t>Built a two-step symbolic read-out in which a Kolmogorov-Arnold Network (KAN) supplies only the monomial support and the coefficients are re-estimated by a convex quadratic program under affine negative-feedback constraints — eliminating a sign pathology present on up to 30% of the operating box for at most 0.2 percentage points of accuracy.</w:t>
+        <w:t>Built a two-step symbolic read-out in which a Kolmogorov–Arnold Network (KAN) supplies only the monomial support and the coefficients are re-estimated by a convex quadratic program under affine negative-feedback constraints — eliminating a sign pathology present on up to 30% of the operating box for at most 0.2 percentage points of accuracy.</w:t>
       </w:r>
     </w:p>
     <w:p>
@@ -1001,7 +1016,7 @@
         </w:rPr>
         <w:t xml:space="preserve"> </w:t>
         <w:br/>
-        <w:t xml:space="preserve">Kolmogorov-Arnold Networks, system identification, embedded SciML.</w:t>
+        <w:t xml:space="preserve">Kolmogorov–Arnold Networks, system identification, embedded SciML.</w:t>
         <w:br/>
         <w:br/>
       </w:r>

</xml_diff>

<commit_message>
Publish Papers II and III as one unlisted arc with Paper I
The write-up at /projects/project-four/ now covers the three-paper
sequence rather than Paper I alone, states the shared AI-assistance
disclosure once at the top and once in full at the bottom, and stays
unlisted. The two new preprints get descriptive filenames and their own
robots.txt entries. The CV lists all three as items 4-6 with the shared
disclosure under the list, in the page, the docx and the exported PDF.

Co-Authored-By: Claude Opus 5 <noreply@anthropic.com>
</commit_message>
<xml_diff>
--- a/CV_for_MSc.docx
+++ b/CV_for_MSc.docx
@@ -367,7 +367,109 @@
           <w:iCs/>
           <w:color w:val="1D1C1D"/>
         </w:rPr>
-        <w:t xml:space="preserve">Preprint, September 2026; produced with substantial AI assistance under my direction, not yet independently reviewed.</w:t>
+        <w:t xml:space="preserve">Paper I of three; preprint, September 2026.</w:t>
+      </w:r>
+    </w:p>
+    <w:p>
+      <w:pPr>
+        <w:pStyle w:val="ListParagraph"/>
+        <w:numPr>
+          <w:ilvl w:val="0"/>
+          <w:numId w:val="9"/>
+        </w:numPr>
+        <w:spacing w:line="240" w:lineRule="auto"/>
+        <w:ind w:right="180"/>
+        <w:rPr>
+          <w:bCs/>
+          <w:color w:val="1D1C1D"/>
+        </w:rPr>
+      </w:pPr>
+      <w:r>
+        <w:rPr>
+          <w:b/>
+          <w:bCs/>
+          <w:color w:val="1D1C1D"/>
+        </w:rPr>
+        <w:t xml:space="preserve">A. Salkimbayev. </w:t>
+      </w:r>
+      <w:r>
+        <w:rPr>
+          <w:bCs/>
+          <w:color w:val="1D1C1D"/>
+        </w:rPr>
+        <w:t xml:space="preserve">“The Isotropic Directional Obstruction for Cascade Operators.” </w:t>
+      </w:r>
+      <w:r>
+        <w:rPr>
+          <w:bCs/>
+          <w:i/>
+          <w:iCs/>
+          <w:color w:val="1D1C1D"/>
+        </w:rPr>
+        <w:t xml:space="preserve">Paper II of three; preprint, September 2026.</w:t>
+      </w:r>
+    </w:p>
+    <w:p>
+      <w:pPr>
+        <w:pStyle w:val="ListParagraph"/>
+        <w:numPr>
+          <w:ilvl w:val="0"/>
+          <w:numId w:val="9"/>
+        </w:numPr>
+        <w:spacing w:line="240" w:lineRule="auto"/>
+        <w:ind w:right="180"/>
+        <w:rPr>
+          <w:bCs/>
+          <w:color w:val="1D1C1D"/>
+        </w:rPr>
+      </w:pPr>
+      <w:r>
+        <w:rPr>
+          <w:b/>
+          <w:bCs/>
+          <w:color w:val="1D1C1D"/>
+        </w:rPr>
+        <w:t xml:space="preserve">A. Salkimbayev. </w:t>
+      </w:r>
+      <w:r>
+        <w:rPr>
+          <w:bCs/>
+          <w:color w:val="1D1C1D"/>
+        </w:rPr>
+        <w:t xml:space="preserve">“Cross-Triad Rigidity for Cascade Operators.” </w:t>
+      </w:r>
+      <w:r>
+        <w:rPr>
+          <w:bCs/>
+          <w:i/>
+          <w:iCs/>
+          <w:color w:val="1D1C1D"/>
+        </w:rPr>
+        <w:t xml:space="preserve">Paper III of three; preprint, September 2026.</w:t>
+      </w:r>
+    </w:p>
+    <w:p>
+      <w:pPr>
+        <w:pStyle w:val="ListParagraph"/>
+        <w:numPr>
+          <w:ilvl w:val="0"/>
+          <w:numId w:val="9"/>
+        </w:numPr>
+        <w:spacing w:line="240" w:lineRule="auto"/>
+        <w:ind w:right="180"/>
+        <w:rPr>
+          <w:bCs/>
+          <w:color w:val="1D1C1D"/>
+        </w:rPr>
+      </w:pPr>
+      <w:r>
+        <w:rPr>
+          <w:bCs/>
+          <w:i/>
+          <w:iCs/>
+          <w:color w:val="1D1C1D"/>
+        </w:rPr>
+        <w:t xml:space="preserve">All three of the above were produced with substantial AI assistance under my direction; I am responsible for the contents. Not yet independently reviewed.</w:t>
       </w:r>
     </w:p>
     <w:p>

</xml_diff>

<commit_message>
Add Paper IV, which settles what the trilogy left open
Momentum helicity separates the two classes where energy cannot: every
argument in Papers I-III rests on the energy identity, which is exactly
what Tao's cancellation condition preserves, so no linear functional
can tell them apart. The helicity of the momentum is a Casimir of the
Lie-Poisson structure, conserved by every Euler-Arnold flow and not
imposed by Tao's condition, and the resulting test collapses to
linear algebra: corank one with an entrywise positive null vector for
Euler-Arnold, full rank for cascade operators.

The write-up becomes Papers I-IV, robots.txt covers the new PDF, and
the CV lists it as item 7 in the page, the docx and the exported PDF.

Co-Authored-By: Claude Opus 5 <noreply@anthropic.com>
</commit_message>
<xml_diff>
--- a/CV_for_MSc.docx
+++ b/CV_for_MSc.docx
@@ -367,7 +367,7 @@
           <w:iCs/>
           <w:color w:val="1D1C1D"/>
         </w:rPr>
-        <w:t xml:space="preserve">Paper I of three; preprint, September 2026.</w:t>
+        <w:t xml:space="preserve">Paper I of four; preprint, September 2026.</w:t>
       </w:r>
     </w:p>
     <w:p>
@@ -406,7 +406,7 @@
           <w:iCs/>
           <w:color w:val="1D1C1D"/>
         </w:rPr>
-        <w:t xml:space="preserve">Paper II of three; preprint, September 2026.</w:t>
+        <w:t xml:space="preserve">Paper II of four; preprint, September 2026.</w:t>
       </w:r>
     </w:p>
     <w:p>
@@ -445,7 +445,7 @@
           <w:iCs/>
           <w:color w:val="1D1C1D"/>
         </w:rPr>
-        <w:t xml:space="preserve">Paper III of three; preprint, September 2026.</w:t>
+        <w:t xml:space="preserve">Paper III of four; preprint, September 2026.</w:t>
       </w:r>
     </w:p>
     <w:p>
@@ -464,12 +464,51 @@
       </w:pPr>
       <w:r>
         <w:rPr>
+          <w:b/>
+          <w:bCs/>
+          <w:color w:val="1D1C1D"/>
+        </w:rPr>
+        <w:t xml:space="preserve">A. Salkimbayev. </w:t>
+      </w:r>
+      <w:r>
+        <w:rPr>
+          <w:bCs/>
+          <w:color w:val="1D1C1D"/>
+        </w:rPr>
+        <w:t xml:space="preserve">“Momentum Helicity Separates Cascade Operators from Euler–Arnold Operators.” </w:t>
+      </w:r>
+      <w:r>
+        <w:rPr>
           <w:bCs/>
           <w:i/>
           <w:iCs/>
           <w:color w:val="1D1C1D"/>
         </w:rPr>
-        <w:t xml:space="preserve">All three of the above were produced with substantial AI assistance under my direction; I am responsible for the contents. Not yet independently reviewed.</w:t>
+        <w:t xml:space="preserve">Paper IV of four; preprint, September 2026.</w:t>
+      </w:r>
+    </w:p>
+    <w:p>
+      <w:pPr>
+        <w:pStyle w:val="ListParagraph"/>
+        <w:numPr>
+          <w:ilvl w:val="0"/>
+          <w:numId w:val="9"/>
+        </w:numPr>
+        <w:spacing w:line="240" w:lineRule="auto"/>
+        <w:ind w:right="180"/>
+        <w:rPr>
+          <w:bCs/>
+          <w:color w:val="1D1C1D"/>
+        </w:rPr>
+      </w:pPr>
+      <w:r>
+        <w:rPr>
+          <w:bCs/>
+          <w:i/>
+          <w:iCs/>
+          <w:color w:val="1D1C1D"/>
+        </w:rPr>
+        <w:t xml:space="preserve">All four of the above were produced with substantial AI assistance under my direction; I am responsible for the contents. Not yet independently reviewed.</w:t>
       </w:r>
     </w:p>
     <w:p>

</xml_diff>

<commit_message>
Add Paper V and the viscous section of Paper IV
Paper V is a companion rather than a fifth rigidity theorem: a
Beale-Kato-Majda continuation criterion for the right-invariant H^s
metrics on SDiff(T^3), with classical BKM as the endpoint s -> 0+. It
is the only paper in the sequence with nothing labelled numerical.

Paper IV gains section 7: the criterion survives viscosity unchanged
and uniformly in the viscosity parameter, since the dissipative term
is common to both classes and cancels from the comparison. Nine pages.

Papers I, II and III were re-dropped byte-identical (Paper I differed
only in its pdfTeX timestamp), so they are left as they are.

Co-Authored-By: Claude Opus 5 <noreply@anthropic.com>
</commit_message>
<xml_diff>
--- a/CV_for_MSc.docx
+++ b/CV_for_MSc.docx
@@ -367,7 +367,7 @@
           <w:iCs/>
           <w:color w:val="1D1C1D"/>
         </w:rPr>
-        <w:t xml:space="preserve">Paper I of four; preprint, September 2026.</w:t>
+        <w:t xml:space="preserve">Paper I of five; preprint, September 2026.</w:t>
       </w:r>
     </w:p>
     <w:p>
@@ -406,7 +406,7 @@
           <w:iCs/>
           <w:color w:val="1D1C1D"/>
         </w:rPr>
-        <w:t xml:space="preserve">Paper II of four; preprint, September 2026.</w:t>
+        <w:t xml:space="preserve">Paper II of five; preprint, September 2026.</w:t>
       </w:r>
     </w:p>
     <w:p>
@@ -445,7 +445,7 @@
           <w:iCs/>
           <w:color w:val="1D1C1D"/>
         </w:rPr>
-        <w:t xml:space="preserve">Paper III of four; preprint, September 2026.</w:t>
+        <w:t xml:space="preserve">Paper III of five; preprint, September 2026.</w:t>
       </w:r>
     </w:p>
     <w:p>
@@ -484,7 +484,7 @@
           <w:iCs/>
           <w:color w:val="1D1C1D"/>
         </w:rPr>
-        <w:t xml:space="preserve">Paper IV of four; preprint, September 2026.</w:t>
+        <w:t xml:space="preserve">Paper IV of five; preprint, September 2026.</w:t>
       </w:r>
     </w:p>
     <w:p>
@@ -503,12 +503,51 @@
       </w:pPr>
       <w:r>
         <w:rPr>
+          <w:b/>
+          <w:bCs/>
+          <w:color w:val="1D1C1D"/>
+        </w:rPr>
+        <w:t xml:space="preserve">A. Salkimbayev. </w:t>
+      </w:r>
+      <w:r>
+        <w:rPr>
+          <w:bCs/>
+          <w:color w:val="1D1C1D"/>
+        </w:rPr>
+        <w:t xml:space="preserve">“A Beale–Kato–Majda Criterion for Right-Invariant Hˢ Metrics on SDiff(T³).” </w:t>
+      </w:r>
+      <w:r>
+        <w:rPr>
           <w:bCs/>
           <w:i/>
           <w:iCs/>
           <w:color w:val="1D1C1D"/>
         </w:rPr>
-        <w:t xml:space="preserve">All four of the above were produced with substantial AI assistance under my direction; I am responsible for the contents. Not yet independently reviewed.</w:t>
+        <w:t xml:space="preserve">Paper V of five; preprint, September 2026.</w:t>
+      </w:r>
+    </w:p>
+    <w:p>
+      <w:pPr>
+        <w:pStyle w:val="ListParagraph"/>
+        <w:numPr>
+          <w:ilvl w:val="0"/>
+          <w:numId w:val="9"/>
+        </w:numPr>
+        <w:spacing w:line="240" w:lineRule="auto"/>
+        <w:ind w:right="180"/>
+        <w:rPr>
+          <w:bCs/>
+          <w:color w:val="1D1C1D"/>
+        </w:rPr>
+      </w:pPr>
+      <w:r>
+        <w:rPr>
+          <w:bCs/>
+          <w:i/>
+          <w:iCs/>
+          <w:color w:val="1D1C1D"/>
+        </w:rPr>
+        <w:t xml:space="preserve">All five of the above were produced with substantial AI assistance under my direction; I am responsible for the contents. Not yet independently reviewed.</w:t>
       </w:r>
     </w:p>
     <w:p>

</xml_diff>

<commit_message>
Fit the CV back onto two pages
The transport program pushed the Skills section onto a third page.
Tightened without removing anything:
- body text 11pt -> 10.5pt
- margins 0.7in -> 0.6in
- blank section spacers at half height, trailing blank dropped
- the two stacked Skills labels now inline, matching the third
- the transport-program note shortened from four lines to three

Page 1 now ends with the publications list and page 2 opens on
Research Experience, with room to spare at the bottom.

Co-Authored-By: Claude Opus 5.5 <noreply@anthropic.com>
</commit_message>
<xml_diff>
--- a/CV_for_MSc.docx
+++ b/CV_for_MSc.docx
@@ -96,6 +96,8 @@
         <w:ind w:left="180" w:right="180"/>
         <w:jc w:val="center"/>
         <w:rPr>
+          <w:sz w:val="12"/>
+          <w:szCs w:val="12"/>
           <w:color w:val="1D1C1D"/>
         </w:rPr>
       </w:pPr>
@@ -922,14 +924,16 @@
           <w:iCs/>
           <w:color w:val="1D1C1D"/>
         </w:rPr>
-        <w:t xml:space="preserve">The six entries from “Eight Conditions” on form a second program, on transport and the supercriticality gap in 3D Navier–Stokes; none of them resolves the regularity problem, and each says so. All six were produced with substantial AI assistance under my direction; I am responsible for the contents. Not yet independently reviewed.</w:t>
-      </w:r>
-    </w:p>
-    <w:p>
-      <w:pPr>
-        <w:spacing w:line="240" w:lineRule="auto"/>
-        <w:ind w:right="180"/>
-        <w:rPr>
+        <w:t xml:space="preserve">The six entries from “Eight Conditions” on are a second program, on transport in 3D Navier–Stokes; none resolves the regularity problem. Also produced with substantial AI assistance under my direction; not yet independently reviewed.</w:t>
+      </w:r>
+    </w:p>
+    <w:p>
+      <w:pPr>
+        <w:spacing w:line="240" w:lineRule="auto"/>
+        <w:ind w:right="180"/>
+        <w:rPr>
+          <w:sz w:val="12"/>
+          <w:szCs w:val="12"/>
           <w:b/>
           <w:color w:val="1D1C1D"/>
         </w:rPr>
@@ -975,6 +979,8 @@
         <w:spacing w:line="240" w:lineRule="auto"/>
         <w:ind w:right="180"/>
         <w:rPr>
+          <w:sz w:val="12"/>
+          <w:szCs w:val="12"/>
           <w:b/>
           <w:bCs/>
           <w:color w:val="1D1C1D"/>
@@ -1076,6 +1082,8 @@
         <w:spacing w:line="240" w:lineRule="auto"/>
         <w:ind w:right="180"/>
         <w:rPr>
+          <w:sz w:val="12"/>
+          <w:szCs w:val="12"/>
           <w:color w:val="1D1C1D"/>
           <w:lang w:val="en-US"/>
         </w:rPr>
@@ -1172,6 +1180,8 @@
         <w:spacing w:line="240" w:lineRule="auto"/>
         <w:ind w:right="180"/>
         <w:rPr>
+          <w:sz w:val="12"/>
+          <w:szCs w:val="12"/>
           <w:color w:val="1D1C1D"/>
           <w:lang w:val="en-US"/>
         </w:rPr>
@@ -1282,6 +1292,8 @@
         <w:spacing w:line="240" w:lineRule="auto"/>
         <w:ind w:right="180"/>
         <w:rPr>
+          <w:sz w:val="12"/>
+          <w:szCs w:val="12"/>
           <w:color w:val="1D1C1D"/>
         </w:rPr>
       </w:pPr>
@@ -1490,6 +1502,8 @@
         <w:spacing w:line="240" w:lineRule="auto"/>
         <w:ind w:right="180"/>
         <w:rPr>
+          <w:sz w:val="12"/>
+          <w:szCs w:val="12"/>
           <w:b/>
           <w:bCs/>
           <w:color w:val="1D1C1D"/>
@@ -1531,7 +1545,6 @@
           <w:color w:val="1D1C1D"/>
         </w:rPr>
         <w:t xml:space="preserve">Mathematics &amp; Control Systems: </w:t>
-        <w:br/>
       </w:r>
       <w:r>
         <w:rPr>
@@ -1545,6 +1558,8 @@
         <w:spacing w:line="240" w:lineRule="auto"/>
         <w:ind w:right="180"/>
         <w:rPr>
+          <w:sz w:val="12"/>
+          <w:szCs w:val="12"/>
           <w:color w:val="1D1C1D"/>
         </w:rPr>
       </w:pPr>
@@ -1570,7 +1585,6 @@
           <w:color w:val="1D1C1D"/>
         </w:rPr>
         <w:t xml:space="preserve"> </w:t>
-        <w:br/>
         <w:t xml:space="preserve">Kolmogorov–Arnold Networks, system identification, embedded SciML.</w:t>
         <w:br/>
         <w:br/>
@@ -1595,15 +1609,8 @@
         <w:spacing w:line="240" w:lineRule="auto"/>
         <w:ind w:right="180"/>
         <w:rPr>
-          <w:color w:val="1D1C1D"/>
-        </w:rPr>
-      </w:pPr>
-    </w:p>
-    <w:p>
-      <w:pPr>
-        <w:spacing w:line="240" w:lineRule="auto"/>
-        <w:ind w:right="180"/>
-        <w:rPr>
+          <w:sz w:val="12"/>
+          <w:szCs w:val="12"/>
           <w:color w:val="1D1C1D"/>
         </w:rPr>
       </w:pPr>
@@ -1616,7 +1623,7 @@
       <w:headerReference w:type="first" r:id="rId14"/>
       <w:footerReference w:type="first" r:id="rId15"/>
       <w:pgSz w:w="12240" w:h="15840"/>
-      <w:pgMar w:top="1008" w:right="1008" w:bottom="1008" w:left="1008" w:header="720" w:footer="720" w:gutter="0"/>
+      <w:pgMar w:top="864" w:right="864" w:bottom="864" w:left="864" w:header="720" w:footer="720" w:gutter="0"/>
       <w:pgNumType w:start="1"/>
       <w:cols w:space="720"/>
     </w:sectPr>
@@ -3746,8 +3753,8 @@
     <w:rPr>
       <w:rFonts w:ascii="Arial" w:eastAsia="Arial" w:hAnsi="Arial" w:cs="Arial"/>
       <w:kern w:val="0"/>
-      <w:sz w:val="22"/>
-      <w:szCs w:val="22"/>
+      <w:sz w:val="21"/>
+      <w:szCs w:val="21"/>
       <w:lang w:val="en"/>
       <w14:ligatures w14:val="none"/>
     </w:rPr>

</xml_diff>

<commit_message>
Mark the IJACSP paper as a major revision
The adaptive KAN control paper moved from "under review" to a
major-revision decision. Update the CV page, the project remark, and the
Word CV with its PDF export.

Co-Authored-By: Claude Opus 5.5 <noreply@anthropic.com>
</commit_message>
<xml_diff>
--- a/CV_for_MSc.docx
+++ b/CV_for_MSc.docx
@@ -132,6 +132,13 @@
           <w:color w:val="1D1C1D"/>
         </w:rPr>
         <w:t>Kazakh-British Technical University (KBTU)</w:t>
+      </w:r>
+      <w:r>
+        <w:rPr>
+          <w:b/>
+          <w:bCs/>
+          <w:color w:val="1D1C1D"/>
+        </w:rPr>
         <w:br/>
       </w:r>
       <w:r>
@@ -289,7 +296,16 @@
           <w:iCs/>
           <w:color w:val="1D1C1D"/>
         </w:rPr>
-        <w:t xml:space="preserve">Under Review, International Journal of Adaptive Control and Signal Processing.</w:t>
+        <w:t>Major Revision, International Journal</w:t>
+      </w:r>
+      <w:r>
+        <w:rPr>
+          <w:bCs/>
+          <w:i/>
+          <w:iCs/>
+          <w:color w:val="1D1C1D"/>
+        </w:rPr>
+        <w:t xml:space="preserve"> of Adaptive Control and Signal Processing.</w:t>
       </w:r>
     </w:p>
     <w:p>
@@ -328,7 +344,7 @@
           <w:iCs/>
           <w:color w:val="1D1C1D"/>
         </w:rPr>
-        <w:t xml:space="preserve">Expository article; preprint, 34 pp.</w:t>
+        <w:t>Expository article; preprint, 34 pp.</w:t>
       </w:r>
     </w:p>
     <w:p>
@@ -367,7 +383,7 @@
           <w:iCs/>
           <w:color w:val="1D1C1D"/>
         </w:rPr>
-        <w:t xml:space="preserve">Produced with substantial AI assistance under my direction; not yet independently reviewed. Listed with links at hecatetdm.tech/cv.</w:t>
+        <w:t>Produced with substantial AI assistance under my direction; not yet independently reviewed. Listed with links at hecatetdm.tech/cv.</w:t>
       </w:r>
     </w:p>
     <w:p>
@@ -471,7 +487,7 @@
         <w:rPr>
           <w:color w:val="1D1C1D"/>
         </w:rPr>
-        <w:t xml:space="preserve">Developing a novel functional-analytic control architecture drawing upon operator theory and methodologies from Brezis, Evans and Stein.</w:t>
+        <w:t>Developing a novel functional-analytic control architecture drawing upon operator theory and methodologies from Brezis, Evans and Stein.</w:t>
       </w:r>
     </w:p>
     <w:p>
@@ -513,7 +529,7 @@
         <w:rPr>
           <w:color w:val="1D1C1D"/>
         </w:rPr>
-        <w:t xml:space="preserve">Wrote a 34-page expository construction of Leray–Hopf weak solutions to the 2D Navier–Stokes equations on the torus, proving uniqueness in two dimensions and showing where its three-dimensional strong-solution estimate stops.</w:t>
+        <w:t>Wrote a 34-page expository construction of Leray–Hopf weak solutions to the 2D Navier–Stokes equations on the torus, proving uniqueness in two dimensions and showing where its three-dimensional strong-solution estimate stops.</w:t>
       </w:r>
     </w:p>
     <w:p>
@@ -588,7 +604,7 @@
         <w:rPr>
           <w:color w:val="1D1C1D"/>
         </w:rPr>
-        <w:t xml:space="preserve">Derived rigorous Lyapunov stability guarantees (ISS / UUB) over the physically realizable operating envelope, with a certificate that requires no persistent excitation.</w:t>
+        <w:t>Derived rigorous Lyapunov stability guarantees (ISS / UUB) over the physically realizable operating envelope, with a certificate that requires no persistent excitation.</w:t>
       </w:r>
     </w:p>
     <w:p>
@@ -609,7 +625,7 @@
         <w:rPr>
           <w:color w:val="1D1C1D"/>
         </w:rPr>
-        <w:t xml:space="preserve">Evaluated the algorithm on a quadruple-tank benchmark via a 50-seed Monte-Carlo campaign in Python, demonstrating a branch-free per-step runtime bounded a priori and a 7% aggregate tracking improvement over LTV-MPC.</w:t>
+        <w:t>Evaluated the algorithm on a quadruple-tank benchmark via a 50-seed Monte-Carlo campaign in Python, demonstrating a branch-free per-step runtime bounded a priori and a 7% aggregate tracking improvement over LTV-MPC.</w:t>
       </w:r>
     </w:p>
     <w:p>
@@ -676,7 +692,14 @@
         <w:rPr>
           <w:color w:val="1D1C1D"/>
         </w:rPr>
-        <w:t>Designed a certifiable explicit replacement for Linear Time-Varying MPC on the quadruple-tank benchmark in its non-minimum-phase configuration: an analytic feedforward term, a detuned LQR core, and a learned correction behind a gate that vanishes quadratically at the setpoint, making zero steady-state offset and local exponential stability structural rather than dependent on fit quality.</w:t>
+        <w:t xml:space="preserve">Designed a certifiable explicit replacement for Linear Time-Varying MPC on the quadruple-tank benchmark in its non-minimum-phase configuration: an analytic feedforward term, a detuned </w:t>
+      </w:r>
+      <w:r>
+        <w:rPr>
+          <w:color w:val="1D1C1D"/>
+        </w:rPr>
+        <w:lastRenderedPageBreak/>
+        <w:t>LQR core, and a learned correction behind a gate that vanishes quadratically at the setpoint, making zero steady-state offset and local exponential stability structural rather than dependent on fit quality.</w:t>
       </w:r>
     </w:p>
     <w:p>
@@ -762,7 +785,7 @@
         <w:rPr>
           <w:color w:val="1D1C1D"/>
         </w:rPr>
-        <w:t xml:space="preserve">Self-directed graduate sequence in analysis and PDE, directed toward the rigorous study of fluid dynamics:</w:t>
+        <w:t>Self-directed graduate sequence in analysis and PDE, directed toward the rigorous study of fluid dynamics:</w:t>
       </w:r>
     </w:p>
     <w:p>
@@ -833,7 +856,7 @@
           <w:bCs/>
           <w:color w:val="1D1C1D"/>
         </w:rPr>
-        <w:t xml:space="preserve">(Lawrence C. Evans), Chs. 5–6 — Sobolev spaces and second-order elliptic theory.</w:t>
+        <w:t>(Lawrence C. Evans), Chs. 5–6 — Sobolev spaces and second-order elliptic theory.</w:t>
       </w:r>
     </w:p>
     <w:p>
@@ -872,7 +895,7 @@
           <w:bCs/>
           <w:color w:val="1D1C1D"/>
         </w:rPr>
-        <w:t xml:space="preserve">(Elias M. Stein &amp; Rami Shakarchi), Chs. 1–3.</w:t>
+        <w:t>(Elias M. Stein &amp; Rami Shakarchi), Chs. 1–3.</w:t>
       </w:r>
     </w:p>
     <w:p>
@@ -927,7 +950,7 @@
           <w:bCs/>
           <w:color w:val="1D1C1D"/>
         </w:rPr>
-        <w:t xml:space="preserve">(Elias M. Stein).</w:t>
+        <w:t>(Elias M. Stein).</w:t>
       </w:r>
     </w:p>
     <w:p>
@@ -958,6 +981,13 @@
           <w:color w:val="1D1C1D"/>
         </w:rPr>
         <w:t>TECHNICAL &amp; COMPUTATIONAL SKILLS</w:t>
+      </w:r>
+      <w:r>
+        <w:rPr>
+          <w:b/>
+          <w:bCs/>
+          <w:color w:val="1D1C1D"/>
+        </w:rPr>
         <w:br/>
       </w:r>
     </w:p>
@@ -976,13 +1006,20 @@
           <w:color w:val="1D1C1D"/>
         </w:rPr>
         <w:t xml:space="preserve">Mathematics &amp; Control Systems: </w:t>
+      </w:r>
+      <w:r>
+        <w:rPr>
+          <w:b/>
+          <w:bCs/>
+          <w:color w:val="1D1C1D"/>
+        </w:rPr>
         <w:br/>
       </w:r>
       <w:r>
         <w:rPr>
           <w:color w:val="1D1C1D"/>
         </w:rPr>
-        <w:t xml:space="preserve">Operator theory, partial differential equations, semigroup theory, Lyapunov stability analysis, adaptive control, nonlinear control systems</w:t>
+        <w:t>Operator theory, partial differential equations, semigroup theory, Lyapunov stability analysis, adaptive control, nonlinear control systems</w:t>
       </w:r>
     </w:p>
     <w:p>
@@ -1015,9 +1052,24 @@
           <w:color w:val="1D1C1D"/>
         </w:rPr>
         <w:t xml:space="preserve"> </w:t>
+      </w:r>
+      <w:r>
+        <w:rPr>
+          <w:color w:val="1D1C1D"/>
+        </w:rPr>
         <w:br/>
-        <w:t xml:space="preserve">Kolmogorov–Arnold Networks, system identification, embedded SciML.</w:t>
+        <w:t>Kolmogorov–Arnold Networks, system identification, embedded SciML.</w:t>
+      </w:r>
+      <w:r>
+        <w:rPr>
+          <w:color w:val="1D1C1D"/>
+        </w:rPr>
         <w:br/>
+      </w:r>
+      <w:r>
+        <w:rPr>
+          <w:color w:val="1D1C1D"/>
+        </w:rPr>
         <w:br/>
       </w:r>
       <w:r>
@@ -4070,6 +4122,15 @@
 </file>
 
 <file path=customXml/item1.xml><?xml version="1.0" encoding="utf-8"?>
+<?mso-contentType ?>
+<FormTemplates xmlns="http://schemas.microsoft.com/sharepoint/v3/contenttype/forms">
+  <Display>DocumentLibraryForm</Display>
+  <Edit>DocumentLibraryForm</Edit>
+  <New>DocumentLibraryForm</New>
+</FormTemplates>
+</file>
+
+<file path=customXml/item2.xml><?xml version="1.0" encoding="utf-8"?>
 <ct:contentTypeSchema xmlns:ct="http://schemas.microsoft.com/office/2006/metadata/contentType" xmlns:ma="http://schemas.microsoft.com/office/2006/metadata/properties/metaAttributes" ct:_="" ma:_="" ma:contentTypeName="Документ" ma:contentTypeID="0x010100AE5F713ED8B14D4396D16265B509EE73" ma:contentTypeVersion="15" ma:contentTypeDescription="Создание документа." ma:contentTypeScope="" ma:versionID="ebaac3ae5b2a3fe3fc62a90dd8d6517b">
   <xsd:schema xmlns:xsd="http://www.w3.org/2001/XMLSchema" xmlns:xs="http://www.w3.org/2001/XMLSchema" xmlns:p="http://schemas.microsoft.com/office/2006/metadata/properties" xmlns:ns3="8fcac951-c519-4ac6-bd89-e5352741c09f" xmlns:ns4="37eeeb3c-0613-4c76-a3e6-0d484bb27f43" targetNamespace="http://schemas.microsoft.com/office/2006/metadata/properties" ma:root="true" ma:fieldsID="9dbf867a4c7bdaf5c5c7e7b2a7efff8e" ns3:_="" ns4:_="">
     <xsd:import namespace="8fcac951-c519-4ac6-bd89-e5352741c09f"/>
@@ -4302,15 +4363,6 @@
 </ct:contentTypeSchema>
 </file>
 
-<file path=customXml/item2.xml><?xml version="1.0" encoding="utf-8"?>
-<?mso-contentType ?>
-<FormTemplates xmlns="http://schemas.microsoft.com/sharepoint/v3/contenttype/forms">
-  <Display>DocumentLibraryForm</Display>
-  <Edit>DocumentLibraryForm</Edit>
-  <New>DocumentLibraryForm</New>
-</FormTemplates>
-</file>
-
 <file path=customXml/item3.xml><?xml version="1.0" encoding="utf-8"?>
 <p:properties xmlns:p="http://schemas.microsoft.com/office/2006/metadata/properties" xmlns:xsi="http://www.w3.org/2001/XMLSchema-instance" xmlns:pc="http://schemas.microsoft.com/office/infopath/2007/PartnerControls">
   <documentManagement>
@@ -4320,6 +4372,14 @@
 </file>
 
 <file path=customXml/itemProps1.xml><?xml version="1.0" encoding="utf-8"?>
+<ds:datastoreItem xmlns:ds="http://schemas.openxmlformats.org/officeDocument/2006/customXml" ds:itemID="{35AB145F-34C7-4CCF-B13C-232EB761262A}">
+  <ds:schemaRefs>
+    <ds:schemaRef ds:uri="http://schemas.microsoft.com/sharepoint/v3/contenttype/forms"/>
+  </ds:schemaRefs>
+</ds:datastoreItem>
+</file>
+
+<file path=customXml/itemProps2.xml><?xml version="1.0" encoding="utf-8"?>
 <ds:datastoreItem xmlns:ds="http://schemas.openxmlformats.org/officeDocument/2006/customXml" ds:itemID="{388CDBFD-9E0E-4798-B673-1AFED82230F0}">
   <ds:schemaRefs>
     <ds:schemaRef ds:uri="http://schemas.microsoft.com/office/2006/metadata/contentType"/>
@@ -4334,14 +4394,6 @@
     <ds:schemaRef ds:uri="http://purl.org/dc/elements/1.1/"/>
     <ds:schemaRef ds:uri="http://purl.org/dc/terms/"/>
     <ds:schemaRef ds:uri="http://schemas.microsoft.com/internal/obd"/>
-  </ds:schemaRefs>
-</ds:datastoreItem>
-</file>
-
-<file path=customXml/itemProps2.xml><?xml version="1.0" encoding="utf-8"?>
-<ds:datastoreItem xmlns:ds="http://schemas.openxmlformats.org/officeDocument/2006/customXml" ds:itemID="{35AB145F-34C7-4CCF-B13C-232EB761262A}">
-  <ds:schemaRefs>
-    <ds:schemaRef ds:uri="http://schemas.microsoft.com/sharepoint/v3/contenttype/forms"/>
   </ds:schemaRefs>
 </ds:datastoreItem>
 </file>

</xml_diff>

<commit_message>
Mark the JPC paper as a minor revision
The symbolic MPC certification paper cleared its major revision and is
now in minor revision. Update the CV page, the project remark, and the
Word CV with its PDF export.

Co-Authored-By: Claude Opus 5.5 <noreply@anthropic.com>
</commit_message>
<xml_diff>
--- a/CV_for_MSc.docx
+++ b/CV_for_MSc.docx
@@ -257,7 +257,16 @@
           <w:iCs/>
           <w:color w:val="1D1C1D"/>
         </w:rPr>
-        <w:t>Major Revision, Journal of Process Control.</w:t>
+        <w:t>Minor Revision, Journal of Process Control</w:t>
+      </w:r>
+      <w:r>
+        <w:rPr>
+          <w:bCs/>
+          <w:i/>
+          <w:iCs/>
+          <w:color w:val="1D1C1D"/>
+        </w:rPr>
+        <w:t>.</w:t>
       </w:r>
     </w:p>
     <w:p>
@@ -296,16 +305,7 @@
           <w:iCs/>
           <w:color w:val="1D1C1D"/>
         </w:rPr>
-        <w:t>Major Revision, International Journal</w:t>
-      </w:r>
-      <w:r>
-        <w:rPr>
-          <w:bCs/>
-          <w:i/>
-          <w:iCs/>
-          <w:color w:val="1D1C1D"/>
-        </w:rPr>
-        <w:t xml:space="preserve"> of Adaptive Control and Signal Processing.</w:t>
+        <w:t>Major Revision, International Journal of Adaptive Control and Signal Processing.</w:t>
       </w:r>
     </w:p>
     <w:p>
@@ -4122,15 +4122,6 @@
 </file>
 
 <file path=customXml/item1.xml><?xml version="1.0" encoding="utf-8"?>
-<?mso-contentType ?>
-<FormTemplates xmlns="http://schemas.microsoft.com/sharepoint/v3/contenttype/forms">
-  <Display>DocumentLibraryForm</Display>
-  <Edit>DocumentLibraryForm</Edit>
-  <New>DocumentLibraryForm</New>
-</FormTemplates>
-</file>
-
-<file path=customXml/item2.xml><?xml version="1.0" encoding="utf-8"?>
 <ct:contentTypeSchema xmlns:ct="http://schemas.microsoft.com/office/2006/metadata/contentType" xmlns:ma="http://schemas.microsoft.com/office/2006/metadata/properties/metaAttributes" ct:_="" ma:_="" ma:contentTypeName="Документ" ma:contentTypeID="0x010100AE5F713ED8B14D4396D16265B509EE73" ma:contentTypeVersion="15" ma:contentTypeDescription="Создание документа." ma:contentTypeScope="" ma:versionID="ebaac3ae5b2a3fe3fc62a90dd8d6517b">
   <xsd:schema xmlns:xsd="http://www.w3.org/2001/XMLSchema" xmlns:xs="http://www.w3.org/2001/XMLSchema" xmlns:p="http://schemas.microsoft.com/office/2006/metadata/properties" xmlns:ns3="8fcac951-c519-4ac6-bd89-e5352741c09f" xmlns:ns4="37eeeb3c-0613-4c76-a3e6-0d484bb27f43" targetNamespace="http://schemas.microsoft.com/office/2006/metadata/properties" ma:root="true" ma:fieldsID="9dbf867a4c7bdaf5c5c7e7b2a7efff8e" ns3:_="" ns4:_="">
     <xsd:import namespace="8fcac951-c519-4ac6-bd89-e5352741c09f"/>
@@ -4363,6 +4354,15 @@
 </ct:contentTypeSchema>
 </file>
 
+<file path=customXml/item2.xml><?xml version="1.0" encoding="utf-8"?>
+<?mso-contentType ?>
+<FormTemplates xmlns="http://schemas.microsoft.com/sharepoint/v3/contenttype/forms">
+  <Display>DocumentLibraryForm</Display>
+  <Edit>DocumentLibraryForm</Edit>
+  <New>DocumentLibraryForm</New>
+</FormTemplates>
+</file>
+
 <file path=customXml/item3.xml><?xml version="1.0" encoding="utf-8"?>
 <p:properties xmlns:p="http://schemas.microsoft.com/office/2006/metadata/properties" xmlns:xsi="http://www.w3.org/2001/XMLSchema-instance" xmlns:pc="http://schemas.microsoft.com/office/infopath/2007/PartnerControls">
   <documentManagement>
@@ -4372,14 +4372,6 @@
 </file>
 
 <file path=customXml/itemProps1.xml><?xml version="1.0" encoding="utf-8"?>
-<ds:datastoreItem xmlns:ds="http://schemas.openxmlformats.org/officeDocument/2006/customXml" ds:itemID="{35AB145F-34C7-4CCF-B13C-232EB761262A}">
-  <ds:schemaRefs>
-    <ds:schemaRef ds:uri="http://schemas.microsoft.com/sharepoint/v3/contenttype/forms"/>
-  </ds:schemaRefs>
-</ds:datastoreItem>
-</file>
-
-<file path=customXml/itemProps2.xml><?xml version="1.0" encoding="utf-8"?>
 <ds:datastoreItem xmlns:ds="http://schemas.openxmlformats.org/officeDocument/2006/customXml" ds:itemID="{388CDBFD-9E0E-4798-B673-1AFED82230F0}">
   <ds:schemaRefs>
     <ds:schemaRef ds:uri="http://schemas.microsoft.com/office/2006/metadata/contentType"/>
@@ -4394,6 +4386,14 @@
     <ds:schemaRef ds:uri="http://purl.org/dc/elements/1.1/"/>
     <ds:schemaRef ds:uri="http://purl.org/dc/terms/"/>
     <ds:schemaRef ds:uri="http://schemas.microsoft.com/internal/obd"/>
+  </ds:schemaRefs>
+</ds:datastoreItem>
+</file>
+
+<file path=customXml/itemProps2.xml><?xml version="1.0" encoding="utf-8"?>
+<ds:datastoreItem xmlns:ds="http://schemas.openxmlformats.org/officeDocument/2006/customXml" ds:itemID="{35AB145F-34C7-4CCF-B13C-232EB761262A}">
+  <ds:schemaRefs>
+    <ds:schemaRef ds:uri="http://schemas.microsoft.com/sharepoint/v3/contenttype/forms"/>
   </ds:schemaRefs>
 </ds:datastoreItem>
 </file>

</xml_diff>